<commit_message>
Aim 2b CADD v1.6 vs v1.7 results (R17), Table 1 v1.6 column, manuscript results/discussion/abstract completed
Co-Authored-By: Claude Opus 5.5 <noreply@anthropic.com>
</commit_message>
<xml_diff>
--- a/figures/Tables_1_2.docx
+++ b/figures/Tables_1_2.docx
@@ -112,6 +112,16 @@
             </w:r>
           </w:p>
         </w:tc>
+        <w:tc>
+          <w:p>
+            <w:pPr>
+              <w:pStyle w:val="Normal"/>
+            </w:pPr>
+            <w:r>
+              <w:t>CADD v1.6 PHRED (2026 data)</w:t>
+            </w:r>
+          </w:p>
+        </w:tc>
       </w:tr>
       <w:tr>
         <w:tc>
@@ -204,6 +214,16 @@
             </w:r>
           </w:p>
         </w:tc>
+        <w:tc>
+          <w:p>
+            <w:pPr>
+              <w:pStyle w:val="Normal"/>
+            </w:pPr>
+            <w:r>
+              <w:t>not reached</w:t>
+            </w:r>
+          </w:p>
+        </w:tc>
       </w:tr>
       <w:tr>
         <w:tc>
@@ -296,6 +316,16 @@
             </w:r>
           </w:p>
         </w:tc>
+        <w:tc>
+          <w:p>
+            <w:pPr>
+              <w:pStyle w:val="Normal"/>
+            </w:pPr>
+            <w:r>
+              <w:t>not reached</w:t>
+            </w:r>
+          </w:p>
+        </w:tc>
       </w:tr>
       <w:tr>
         <w:tc>
@@ -388,6 +418,16 @@
             </w:r>
           </w:p>
         </w:tc>
+        <w:tc>
+          <w:p>
+            <w:pPr>
+              <w:pStyle w:val="Normal"/>
+            </w:pPr>
+            <w:r>
+              <w:t>≥ 27.5</w:t>
+            </w:r>
+          </w:p>
+        </w:tc>
       </w:tr>
       <w:tr>
         <w:tc>
@@ -480,6 +520,16 @@
             </w:r>
           </w:p>
         </w:tc>
+        <w:tc>
+          <w:p>
+            <w:pPr>
+              <w:pStyle w:val="Normal"/>
+            </w:pPr>
+            <w:r>
+              <w:t>≥ 25.2</w:t>
+            </w:r>
+          </w:p>
+        </w:tc>
       </w:tr>
       <w:tr>
         <w:tc>
@@ -572,6 +622,16 @@
             </w:r>
           </w:p>
         </w:tc>
+        <w:tc>
+          <w:p>
+            <w:pPr>
+              <w:pStyle w:val="Normal"/>
+            </w:pPr>
+            <w:r>
+              <w:t>≤ 22.9</w:t>
+            </w:r>
+          </w:p>
+        </w:tc>
       </w:tr>
       <w:tr>
         <w:tc>
@@ -664,6 +724,16 @@
             </w:r>
           </w:p>
         </w:tc>
+        <w:tc>
+          <w:p>
+            <w:pPr>
+              <w:pStyle w:val="Normal"/>
+            </w:pPr>
+            <w:r>
+              <w:t>≤ 21.1</w:t>
+            </w:r>
+          </w:p>
+        </w:tc>
       </w:tr>
       <w:tr>
         <w:tc>
@@ -756,6 +826,16 @@
             </w:r>
           </w:p>
         </w:tc>
+        <w:tc>
+          <w:p>
+            <w:pPr>
+              <w:pStyle w:val="Normal"/>
+            </w:pPr>
+            <w:r>
+              <w:t>≤ 7.35</w:t>
+            </w:r>
+          </w:p>
+        </w:tc>
       </w:tr>
       <w:tr>
         <w:tc>
@@ -835,6 +915,16 @@
             </w:pPr>
             <w:r>
               <w:t>—</w:t>
+            </w:r>
+          </w:p>
+        </w:tc>
+        <w:tc>
+          <w:p>
+            <w:pPr>
+              <w:pStyle w:val="Normal"/>
+            </w:pPr>
+            <w:r>
+              <w:t>not reached</w:t>
             </w:r>
           </w:p>
         </w:tc>
@@ -879,7 +969,7 @@
         <w:pStyle w:val="Normal"/>
       </w:pPr>
       <w:r>
-        <w:t xml:space="preserve">CADD v1.6 thresholds from Pejaver et al. (2022; ClinVar 2019 with HGMD- and training-variant exclusions); these were reproduced from the original data with our implementation (Table S1).</w:t>
+        <w:t xml:space="preserve">CADD v1.6 thresholds from Pejaver et al. (2022; ClinVar 2019 with HGMD- and training-variant exclusions); these were reproduced from the original data with our implementation (Table S1). The last column gives CADD v1.6 recalibrated on the same 2026 reference sets as CADD v1.7 (median of five seeds).</w:t>
       </w:r>
     </w:p>
     <w:p>

</xml_diff>